<commit_message>
agregamos informe en pdf, con aclaracion de bonus
</commit_message>
<xml_diff>
--- a/TP1/Informe Práctico TP1.docx
+++ b/TP1/Informe Práctico TP1.docx
@@ -589,16 +589,181 @@
       <w:pPr>
         <w:pStyle w:val="Ttulo2"/>
         <w:rPr>
-          <w:color w:val="000000"/>
-          <w:sz w:val="36"/>
-          <w:szCs w:val="36"/>
-        </w:rPr>
-      </w:pPr>
-      <w:r>
-        <w:rPr>
-          <w:color w:val="000000"/>
-        </w:rPr>
-        <w:t>2. Fundamentos Matemáticos del Algoritmo Desarrollado</w:t>
+          <w:rFonts w:ascii="Times New Roman" w:eastAsia="Times New Roman" w:hAnsi="Times New Roman" w:cs="Times New Roman"/>
+          <w:color w:val="000000"/>
+          <w:kern w:val="0"/>
+          <w:sz w:val="27"/>
+          <w:szCs w:val="27"/>
+          <w:lang w:eastAsia="es-ES_tradnl"/>
+          <w14:ligatures w14:val="none"/>
+        </w:rPr>
+      </w:pPr>
+      <w:bookmarkStart w:id="0" w:name="OLE_LINK2"/>
+      <w:r>
+        <w:rPr>
+          <w:rFonts w:ascii="Times New Roman" w:eastAsia="Times New Roman" w:hAnsi="Times New Roman" w:cs="Times New Roman"/>
+          <w:color w:val="000000"/>
+          <w:kern w:val="0"/>
+          <w:sz w:val="27"/>
+          <w:szCs w:val="27"/>
+          <w:lang w:eastAsia="es-ES_tradnl"/>
+          <w14:ligatures w14:val="none"/>
+        </w:rPr>
+        <w:t xml:space="preserve">Hemos </w:t>
+      </w:r>
+      <w:r>
+        <w:rPr>
+          <w:rFonts w:ascii="Times New Roman" w:eastAsia="Times New Roman" w:hAnsi="Times New Roman" w:cs="Times New Roman"/>
+          <w:color w:val="000000"/>
+          <w:kern w:val="0"/>
+          <w:sz w:val="27"/>
+          <w:szCs w:val="27"/>
+          <w:lang w:eastAsia="es-ES_tradnl"/>
+          <w14:ligatures w14:val="none"/>
+        </w:rPr>
+        <w:t>agregado</w:t>
+      </w:r>
+      <w:r>
+        <w:rPr>
+          <w:rFonts w:ascii="Times New Roman" w:eastAsia="Times New Roman" w:hAnsi="Times New Roman" w:cs="Times New Roman"/>
+          <w:color w:val="000000"/>
+          <w:kern w:val="0"/>
+          <w:sz w:val="27"/>
+          <w:szCs w:val="27"/>
+          <w:lang w:eastAsia="es-ES_tradnl"/>
+          <w14:ligatures w14:val="none"/>
+        </w:rPr>
+        <w:t xml:space="preserve"> un punto</w:t>
+      </w:r>
+      <w:r>
+        <w:rPr>
+          <w:rFonts w:ascii="Times New Roman" w:eastAsia="Times New Roman" w:hAnsi="Times New Roman" w:cs="Times New Roman"/>
+          <w:color w:val="000000"/>
+          <w:kern w:val="0"/>
+          <w:sz w:val="27"/>
+          <w:szCs w:val="27"/>
+          <w:lang w:eastAsia="es-ES_tradnl"/>
+          <w14:ligatures w14:val="none"/>
+        </w:rPr>
+        <w:t xml:space="preserve"> Bonus</w:t>
+      </w:r>
+      <w:r>
+        <w:rPr>
+          <w:rFonts w:ascii="Times New Roman" w:eastAsia="Times New Roman" w:hAnsi="Times New Roman" w:cs="Times New Roman"/>
+          <w:color w:val="000000"/>
+          <w:kern w:val="0"/>
+          <w:sz w:val="27"/>
+          <w:szCs w:val="27"/>
+          <w:lang w:eastAsia="es-ES_tradnl"/>
+          <w14:ligatures w14:val="none"/>
+        </w:rPr>
+        <w:t xml:space="preserve"> (en otro archivo)</w:t>
+      </w:r>
+      <w:r>
+        <w:rPr>
+          <w:rFonts w:ascii="Times New Roman" w:eastAsia="Times New Roman" w:hAnsi="Times New Roman" w:cs="Times New Roman"/>
+          <w:color w:val="000000"/>
+          <w:kern w:val="0"/>
+          <w:sz w:val="27"/>
+          <w:szCs w:val="27"/>
+          <w:lang w:eastAsia="es-ES_tradnl"/>
+          <w14:ligatures w14:val="none"/>
+        </w:rPr>
+        <w:t xml:space="preserve"> que es remplazar la </w:t>
+      </w:r>
+      <w:r>
+        <w:rPr>
+          <w:rFonts w:ascii="Times New Roman" w:eastAsia="Times New Roman" w:hAnsi="Times New Roman" w:cs="Times New Roman"/>
+          <w:color w:val="000000"/>
+          <w:kern w:val="0"/>
+          <w:sz w:val="27"/>
+          <w:szCs w:val="27"/>
+          <w:lang w:eastAsia="es-ES_tradnl"/>
+          <w14:ligatures w14:val="none"/>
+        </w:rPr>
+        <w:t>fórmula</w:t>
+      </w:r>
+      <w:r>
+        <w:rPr>
+          <w:rFonts w:ascii="Times New Roman" w:eastAsia="Times New Roman" w:hAnsi="Times New Roman" w:cs="Times New Roman"/>
+          <w:color w:val="000000"/>
+          <w:kern w:val="0"/>
+          <w:sz w:val="27"/>
+          <w:szCs w:val="27"/>
+          <w:lang w:eastAsia="es-ES_tradnl"/>
+          <w14:ligatures w14:val="none"/>
+        </w:rPr>
+        <w:t xml:space="preserve"> para la ecualización del histograma por la función de cv2.equalizeHist</w:t>
+      </w:r>
+      <w:r>
+        <w:rPr>
+          <w:rFonts w:ascii="Times New Roman" w:eastAsia="Times New Roman" w:hAnsi="Times New Roman" w:cs="Times New Roman"/>
+          <w:color w:val="000000"/>
+          <w:kern w:val="0"/>
+          <w:sz w:val="27"/>
+          <w:szCs w:val="27"/>
+          <w:lang w:eastAsia="es-ES_tradnl"/>
+          <w14:ligatures w14:val="none"/>
+        </w:rPr>
+        <w:t xml:space="preserve"> ya que e</w:t>
+      </w:r>
+      <w:r>
+        <w:rPr>
+          <w:rFonts w:ascii="Times New Roman" w:eastAsia="Times New Roman" w:hAnsi="Times New Roman" w:cs="Times New Roman"/>
+          <w:color w:val="000000"/>
+          <w:kern w:val="0"/>
+          <w:sz w:val="27"/>
+          <w:szCs w:val="27"/>
+          <w:lang w:eastAsia="es-ES_tradnl"/>
+          <w14:ligatures w14:val="none"/>
+        </w:rPr>
+        <w:t>s mucho más rápida porque trabaja en C++</w:t>
+      </w:r>
+      <w:r>
+        <w:rPr>
+          <w:rFonts w:ascii="Times New Roman" w:eastAsia="Times New Roman" w:hAnsi="Times New Roman" w:cs="Times New Roman"/>
+          <w:color w:val="000000"/>
+          <w:kern w:val="0"/>
+          <w:sz w:val="27"/>
+          <w:szCs w:val="27"/>
+          <w:lang w:eastAsia="es-ES_tradnl"/>
+          <w14:ligatures w14:val="none"/>
+        </w:rPr>
+        <w:t>.</w:t>
+      </w:r>
+    </w:p>
+    <w:bookmarkEnd w:id="0"/>
+    <w:p>
+      <w:pPr>
+        <w:rPr>
+          <w:lang w:eastAsia="es-ES_tradnl"/>
+        </w:rPr>
+      </w:pPr>
+    </w:p>
+    <w:p>
+      <w:pPr>
+        <w:pStyle w:val="Ttulo2"/>
+        <w:rPr>
+          <w:color w:val="000000"/>
+        </w:rPr>
+      </w:pPr>
+      <w:r>
+        <w:rPr>
+          <w:color w:val="000000"/>
+        </w:rPr>
+        <w:t>2.</w:t>
+      </w:r>
+      <w:r>
+        <w:rPr>
+          <w:color w:val="000000"/>
+        </w:rPr>
+        <w:t xml:space="preserve"> </w:t>
+      </w:r>
+      <w:r>
+        <w:rPr>
+          <w:color w:val="000000"/>
+        </w:rPr>
+        <w:t>Fundamentos Matemáticos del Algoritmo Desarrollado</w:t>
       </w:r>
     </w:p>
     <w:p>
@@ -1395,6 +1560,7 @@
         <w:rPr>
           <w:color w:val="000000"/>
         </w:rPr>
+        <w:lastRenderedPageBreak/>
         <w:t>3. Desglose de la Implementación Algorítmica (</w:t>
       </w:r>
       <w:proofErr w:type="spellStart"/>
@@ -1521,7 +1687,6 @@
           <w:sz w:val="27"/>
           <w:szCs w:val="27"/>
         </w:rPr>
-        <w:lastRenderedPageBreak/>
         <w:t>Validación de Entradas:</w:t>
       </w:r>
       <w:r>
@@ -2879,6 +3044,7 @@
           <w:sz w:val="27"/>
           <w:szCs w:val="27"/>
         </w:rPr>
+        <w:lastRenderedPageBreak/>
         <w:t>Exportación de Resultados:</w:t>
       </w:r>
       <w:r>
@@ -2969,7 +3135,6 @@
         <w:rPr>
           <w:color w:val="000000"/>
         </w:rPr>
-        <w:lastRenderedPageBreak/>
         <w:t>5. Análisis del Impacto del Tamaño de Ventana y Mejoras Futuras</w:t>
       </w:r>
     </w:p>
@@ -3558,6 +3723,7 @@
       </w:pPr>
       <w:r>
         <w:rPr>
+          <w:noProof/>
           <w:color w:val="000000"/>
         </w:rPr>
         <w:drawing>
@@ -3606,6 +3772,7 @@
       </w:pPr>
       <w:r>
         <w:rPr>
+          <w:noProof/>
           <w:color w:val="000000"/>
         </w:rPr>
         <w:drawing>
@@ -6194,7 +6361,6 @@
         <w:pStyle w:val="Ttulo1"/>
         <w:rPr>
           <w:color w:val="000000"/>
-          <w:lang w:val="en-US"/>
         </w:rPr>
       </w:pPr>
       <w:r>
@@ -6207,6 +6373,9 @@
     </w:p>
     <w:p>
       <w:r>
+        <w:rPr>
+          <w:noProof/>
+        </w:rPr>
         <w:drawing>
           <wp:inline distT="0" distB="0" distL="0" distR="0" wp14:anchorId="136AAB71" wp14:editId="7E3FC8CB">
             <wp:extent cx="5499100" cy="4038600"/>
@@ -6261,6 +6430,9 @@
     </w:p>
     <w:p>
       <w:r>
+        <w:rPr>
+          <w:noProof/>
+        </w:rPr>
         <w:drawing>
           <wp:inline distT="0" distB="0" distL="0" distR="0" wp14:anchorId="55A0C266" wp14:editId="14E42F6B">
             <wp:extent cx="5761355" cy="1528445"/>

</xml_diff>